<commit_message>
updated template removed signature img
</commit_message>
<xml_diff>
--- a/assets/Template.docx
+++ b/assets/Template.docx
@@ -1,6 +1,6 @@
 
 <file path=word/document.xml><?xml version="1.0" encoding="utf-8"?>
-<w:document xmlns:wpc="http://schemas.microsoft.com/office/word/2010/wordprocessingCanvas" xmlns:cx="http://schemas.microsoft.com/office/drawing/2014/chartex" xmlns:cx1="http://schemas.microsoft.com/office/drawing/2015/9/8/chartex" xmlns:cx2="http://schemas.microsoft.com/office/drawing/2015/10/21/chartex" xmlns:cx3="http://schemas.microsoft.com/office/drawing/2016/5/9/chartex" xmlns:cx4="http://schemas.microsoft.com/office/drawing/2016/5/10/chartex" xmlns:cx5="http://schemas.microsoft.com/office/drawing/2016/5/11/chartex" xmlns:cx6="http://schemas.microsoft.com/office/drawing/2016/5/12/chartex" xmlns:cx7="http://schemas.microsoft.com/office/drawing/2016/5/13/chartex" xmlns:cx8="http://schemas.microsoft.com/office/drawing/2016/5/14/chartex" xmlns:mc="http://schemas.openxmlformats.org/markup-compatibility/2006" xmlns:aink="http://schemas.microsoft.com/office/drawing/2016/ink" xmlns:am3d="http://schemas.microsoft.com/office/drawing/2017/model3d" xmlns:o="urn:schemas-microsoft-com:office:office" xmlns:oel="http://schemas.microsoft.com/office/2019/extlst" xmlns:r="http://schemas.openxmlformats.org/officeDocument/2006/relationships" xmlns:m="http://schemas.openxmlformats.org/officeDocument/2006/math" xmlns:v="urn:schemas-microsoft-com:vml" xmlns:wp14="http://schemas.microsoft.com/office/word/2010/wordprocessingDrawing" xmlns:wp="http://schemas.openxmlformats.org/drawingml/2006/wordprocessingDrawing" xmlns:w10="urn:schemas-microsoft-com:office:word" xmlns:w="http://schemas.openxmlformats.org/wordprocessingml/2006/main" xmlns:w14="http://schemas.microsoft.com/office/word/2010/wordml" xmlns:w15="http://schemas.microsoft.com/office/word/2012/wordml" xmlns:w16cex="http://schemas.microsoft.com/office/word/2018/wordml/cex" xmlns:w16cid="http://schemas.microsoft.com/office/word/2016/wordml/cid" xmlns:w16="http://schemas.microsoft.com/office/word/2018/wordml" xmlns:w16du="http://schemas.microsoft.com/office/word/2023/wordml/word16du" xmlns:w16sdtdh="http://schemas.microsoft.com/office/word/2020/wordml/sdtdatahash" xmlns:w16sdtfl="http://schemas.microsoft.com/office/word/2024/wordml/sdtformatlock" xmlns:w16se="http://schemas.microsoft.com/office/word/2015/wordml/symex" xmlns:wpg="http://schemas.microsoft.com/office/word/2010/wordprocessingGroup" xmlns:wpi="http://schemas.microsoft.com/office/word/2010/wordprocessingInk" xmlns:wne="http://schemas.microsoft.com/office/word/2006/wordml" xmlns:wps="http://schemas.microsoft.com/office/word/2010/wordprocessingShape" mc:Ignorable="w14 w15 w16se w16cid w16 w16cex w16sdtdh w16sdtfl w16du wp14">
+<w:document xmlns:wpc="http://schemas.microsoft.com/office/word/2010/wordprocessingCanvas" xmlns:cx="http://schemas.microsoft.com/office/drawing/2014/chartex" xmlns:cx1="http://schemas.microsoft.com/office/drawing/2015/9/8/chartex" xmlns:cx2="http://schemas.microsoft.com/office/drawing/2015/10/21/chartex" xmlns:cx3="http://schemas.microsoft.com/office/drawing/2016/5/9/chartex" xmlns:cx4="http://schemas.microsoft.com/office/drawing/2016/5/10/chartex" xmlns:cx5="http://schemas.microsoft.com/office/drawing/2016/5/11/chartex" xmlns:cx6="http://schemas.microsoft.com/office/drawing/2016/5/12/chartex" xmlns:cx7="http://schemas.microsoft.com/office/drawing/2016/5/13/chartex" xmlns:cx8="http://schemas.microsoft.com/office/drawing/2016/5/14/chartex" xmlns:mc="http://schemas.openxmlformats.org/markup-compatibility/2006" xmlns:aink="http://schemas.microsoft.com/office/drawing/2016/ink" xmlns:am3d="http://schemas.microsoft.com/office/drawing/2017/model3d" xmlns:o="urn:schemas-microsoft-com:office:office" xmlns:oel="http://schemas.microsoft.com/office/2019/extlst" xmlns:r="http://schemas.openxmlformats.org/officeDocument/2006/relationships" xmlns:m="http://schemas.openxmlformats.org/officeDocument/2006/math" xmlns:v="urn:schemas-microsoft-com:vml" xmlns:wp14="http://schemas.microsoft.com/office/word/2010/wordprocessingDrawing" xmlns:wp="http://schemas.openxmlformats.org/drawingml/2006/wordprocessingDrawing" xmlns:w10="urn:schemas-microsoft-com:office:word" xmlns:w="http://schemas.openxmlformats.org/wordprocessingml/2006/main" xmlns:w14="http://schemas.microsoft.com/office/word/2010/wordml" xmlns:w15="http://schemas.microsoft.com/office/word/2012/wordml" xmlns:w16cei="http://schemas.microsoft.com/office/word/2026/wordml/cei" xmlns:w16cex="http://schemas.microsoft.com/office/word/2018/wordml/cex" xmlns:w16cid="http://schemas.microsoft.com/office/word/2016/wordml/cid" xmlns:w16="http://schemas.microsoft.com/office/word/2018/wordml" xmlns:w16du="http://schemas.microsoft.com/office/word/2023/wordml/word16du" xmlns:w16sdtdh="http://schemas.microsoft.com/office/word/2020/wordml/sdtdatahash" xmlns:w16sdtfl="http://schemas.microsoft.com/office/word/2024/wordml/sdtformatlock" xmlns:w16se="http://schemas.microsoft.com/office/word/2015/wordml/symex" xmlns:wpg="http://schemas.microsoft.com/office/word/2010/wordprocessingGroup" xmlns:wpi="http://schemas.microsoft.com/office/word/2010/wordprocessingInk" xmlns:wne="http://schemas.microsoft.com/office/word/2006/wordml" xmlns:wps="http://schemas.microsoft.com/office/word/2010/wordprocessingShape" mc:Ignorable="w14 w15 w16se w16cid w16 w16cex w16sdtdh w16sdtfl w16du wp14">
   <w:body>
     <w:p>
       <w:pPr>
@@ -2489,93 +2489,6 @@
         </w:rPr>
         <w:t xml:space="preserve"> CHS Ltd</w:t>
       </w:r>
-    </w:p>
-    <w:p>
-      <w:pPr>
-        <w:pStyle w:val="00Body"/>
-        <w:ind w:left="8028"/>
-        <w:rPr>
-          <w:rFonts w:ascii="Times New Roman" w:hAnsi="Times New Roman" w:cs="Times New Roman"/>
-          <w:sz w:val="24"/>
-          <w:szCs w:val="24"/>
-          <w:lang w:val="en-GB"/>
-        </w:rPr>
-      </w:pPr>
-      <w:r>
-        <w:rPr>
-          <w:rFonts w:ascii="Times New Roman" w:hAnsi="Times New Roman" w:cs="Times New Roman"/>
-          <w:b/>
-          <w:bCs/>
-          <w:noProof/>
-          <w:sz w:val="24"/>
-          <w:szCs w:val="24"/>
-          <w:lang w:val="en-GB"/>
-        </w:rPr>
-        <w:drawing>
-          <wp:anchor distT="0" distB="0" distL="114300" distR="114300" simplePos="0" relativeHeight="251660288" behindDoc="0" locked="0" layoutInCell="1" allowOverlap="1" wp14:anchorId="3945FB8E" wp14:editId="53A3E29E">
-            <wp:simplePos x="0" y="0"/>
-            <wp:positionH relativeFrom="column">
-              <wp:posOffset>5013960</wp:posOffset>
-            </wp:positionH>
-            <wp:positionV relativeFrom="paragraph">
-              <wp:posOffset>4445</wp:posOffset>
-            </wp:positionV>
-            <wp:extent cx="1455420" cy="373380"/>
-            <wp:effectExtent l="0" t="0" r="0" b="7620"/>
-            <wp:wrapNone/>
-            <wp:docPr id="979258575" name="Picture 1"/>
-            <wp:cNvGraphicFramePr>
-              <a:graphicFrameLocks xmlns:a="http://schemas.openxmlformats.org/drawingml/2006/main" noChangeAspect="1"/>
-            </wp:cNvGraphicFramePr>
-            <a:graphic xmlns:a="http://schemas.openxmlformats.org/drawingml/2006/main">
-              <a:graphicData uri="http://schemas.openxmlformats.org/drawingml/2006/picture">
-                <pic:pic xmlns:pic="http://schemas.openxmlformats.org/drawingml/2006/picture">
-                  <pic:nvPicPr>
-                    <pic:cNvPr id="979258575" name="Picture 979258575"/>
-                    <pic:cNvPicPr/>
-                  </pic:nvPicPr>
-                  <pic:blipFill rotWithShape="1">
-                    <a:blip r:embed="rId8" cstate="print">
-                      <a:extLst>
-                        <a:ext uri="{28A0092B-C50C-407E-A947-70E740481C1C}">
-                          <a14:useLocalDpi xmlns:a14="http://schemas.microsoft.com/office/drawing/2010/main" val="0"/>
-                        </a:ext>
-                      </a:extLst>
-                    </a:blip>
-                    <a:srcRect t="1" r="15393" b="34736"/>
-                    <a:stretch>
-                      <a:fillRect/>
-                    </a:stretch>
-                  </pic:blipFill>
-                  <pic:spPr bwMode="auto">
-                    <a:xfrm>
-                      <a:off x="0" y="0"/>
-                      <a:ext cx="1455420" cy="373380"/>
-                    </a:xfrm>
-                    <a:prstGeom prst="rect">
-                      <a:avLst/>
-                    </a:prstGeom>
-                    <a:ln>
-                      <a:noFill/>
-                    </a:ln>
-                    <a:extLst>
-                      <a:ext uri="{53640926-AAD7-44D8-BBD7-CCE9431645EC}">
-                        <a14:shadowObscured xmlns:a14="http://schemas.microsoft.com/office/drawing/2010/main"/>
-                      </a:ext>
-                    </a:extLst>
-                  </pic:spPr>
-                </pic:pic>
-              </a:graphicData>
-            </a:graphic>
-            <wp14:sizeRelH relativeFrom="margin">
-              <wp14:pctWidth>0</wp14:pctWidth>
-            </wp14:sizeRelH>
-            <wp14:sizeRelV relativeFrom="margin">
-              <wp14:pctHeight>0</wp14:pctHeight>
-            </wp14:sizeRelV>
-          </wp:anchor>
-        </w:drawing>
-      </w:r>
       <w:r>
         <w:rPr>
           <w:rFonts w:ascii="Times New Roman" w:hAnsi="Times New Roman" w:cs="Times New Roman"/>
@@ -2583,16 +2496,7 @@
           <w:szCs w:val="24"/>
           <w:lang w:val="en-GB"/>
         </w:rPr>
-        <w:t xml:space="preserve">    </w:t>
-      </w:r>
-      <w:r>
-        <w:rPr>
-          <w:rFonts w:ascii="Times New Roman" w:hAnsi="Times New Roman" w:cs="Times New Roman"/>
-          <w:sz w:val="24"/>
-          <w:szCs w:val="24"/>
-          <w:lang w:val="en-GB"/>
-        </w:rPr>
-        <w:br/>
+        <w:t xml:space="preserve"> </w:t>
       </w:r>
       <w:r>
         <w:rPr>
@@ -2617,9 +2521,31 @@
         <w:t>Authorized Signatory</w:t>
       </w:r>
     </w:p>
+    <w:p>
+      <w:pPr>
+        <w:pStyle w:val="00Body"/>
+        <w:ind w:left="4734" w:firstLine="306"/>
+        <w:rPr>
+          <w:rFonts w:ascii="Courier New" w:hAnsi="Courier New" w:cs="Courier New"/>
+          <w:b/>
+          <w:bCs/>
+          <w:sz w:val="20"/>
+          <w:lang w:val="en-GB"/>
+        </w:rPr>
+      </w:pPr>
+      <w:r>
+        <w:rPr>
+          <w:rFonts w:ascii="Courier New" w:hAnsi="Courier New" w:cs="Courier New"/>
+          <w:b/>
+          <w:bCs/>
+          <w:sz w:val="20"/>
+        </w:rPr>
+        <w:t>Computer Generated Bill - Signature Not Required</w:t>
+      </w:r>
+    </w:p>
     <w:sectPr>
-      <w:headerReference w:type="default" r:id="rId9"/>
-      <w:footerReference w:type="default" r:id="rId10"/>
+      <w:headerReference w:type="default" r:id="rId8"/>
+      <w:footerReference w:type="default" r:id="rId9"/>
       <w:pgSz w:w="11907" w:h="16839"/>
       <w:pgMar w:top="1417" w:right="0" w:bottom="1417" w:left="0" w:header="720" w:footer="431" w:gutter="0"/>
       <w:cols w:space="720"/>
@@ -2630,7 +2556,7 @@
 </file>
 
 <file path=word/endnotes.xml><?xml version="1.0" encoding="utf-8"?>
-<w:endnotes xmlns:wpc="http://schemas.microsoft.com/office/word/2010/wordprocessingCanvas" xmlns:cx="http://schemas.microsoft.com/office/drawing/2014/chartex" xmlns:cx1="http://schemas.microsoft.com/office/drawing/2015/9/8/chartex" xmlns:cx2="http://schemas.microsoft.com/office/drawing/2015/10/21/chartex" xmlns:cx3="http://schemas.microsoft.com/office/drawing/2016/5/9/chartex" xmlns:cx4="http://schemas.microsoft.com/office/drawing/2016/5/10/chartex" xmlns:cx5="http://schemas.microsoft.com/office/drawing/2016/5/11/chartex" xmlns:cx6="http://schemas.microsoft.com/office/drawing/2016/5/12/chartex" xmlns:cx7="http://schemas.microsoft.com/office/drawing/2016/5/13/chartex" xmlns:cx8="http://schemas.microsoft.com/office/drawing/2016/5/14/chartex" xmlns:mc="http://schemas.openxmlformats.org/markup-compatibility/2006" xmlns:aink="http://schemas.microsoft.com/office/drawing/2016/ink" xmlns:am3d="http://schemas.microsoft.com/office/drawing/2017/model3d" xmlns:o="urn:schemas-microsoft-com:office:office" xmlns:oel="http://schemas.microsoft.com/office/2019/extlst" xmlns:r="http://schemas.openxmlformats.org/officeDocument/2006/relationships" xmlns:m="http://schemas.openxmlformats.org/officeDocument/2006/math" xmlns:v="urn:schemas-microsoft-com:vml" xmlns:wp14="http://schemas.microsoft.com/office/word/2010/wordprocessingDrawing" xmlns:wp="http://schemas.openxmlformats.org/drawingml/2006/wordprocessingDrawing" xmlns:w10="urn:schemas-microsoft-com:office:word" xmlns:w="http://schemas.openxmlformats.org/wordprocessingml/2006/main" xmlns:w14="http://schemas.microsoft.com/office/word/2010/wordml" xmlns:w15="http://schemas.microsoft.com/office/word/2012/wordml" xmlns:w16cex="http://schemas.microsoft.com/office/word/2018/wordml/cex" xmlns:w16cid="http://schemas.microsoft.com/office/word/2016/wordml/cid" xmlns:w16="http://schemas.microsoft.com/office/word/2018/wordml" xmlns:w16du="http://schemas.microsoft.com/office/word/2023/wordml/word16du" xmlns:w16sdtdh="http://schemas.microsoft.com/office/word/2020/wordml/sdtdatahash" xmlns:w16sdtfl="http://schemas.microsoft.com/office/word/2024/wordml/sdtformatlock" xmlns:w16se="http://schemas.microsoft.com/office/word/2015/wordml/symex" xmlns:wpg="http://schemas.microsoft.com/office/word/2010/wordprocessingGroup" xmlns:wpi="http://schemas.microsoft.com/office/word/2010/wordprocessingInk" xmlns:wne="http://schemas.microsoft.com/office/word/2006/wordml" xmlns:wps="http://schemas.microsoft.com/office/word/2010/wordprocessingShape" mc:Ignorable="w14 w15 w16se w16cid w16 w16cex w16sdtdh w16sdtfl w16du wp14">
+<w:endnotes xmlns:wpc="http://schemas.microsoft.com/office/word/2010/wordprocessingCanvas" xmlns:cx="http://schemas.microsoft.com/office/drawing/2014/chartex" xmlns:cx1="http://schemas.microsoft.com/office/drawing/2015/9/8/chartex" xmlns:cx2="http://schemas.microsoft.com/office/drawing/2015/10/21/chartex" xmlns:cx3="http://schemas.microsoft.com/office/drawing/2016/5/9/chartex" xmlns:cx4="http://schemas.microsoft.com/office/drawing/2016/5/10/chartex" xmlns:cx5="http://schemas.microsoft.com/office/drawing/2016/5/11/chartex" xmlns:cx6="http://schemas.microsoft.com/office/drawing/2016/5/12/chartex" xmlns:cx7="http://schemas.microsoft.com/office/drawing/2016/5/13/chartex" xmlns:cx8="http://schemas.microsoft.com/office/drawing/2016/5/14/chartex" xmlns:mc="http://schemas.openxmlformats.org/markup-compatibility/2006" xmlns:aink="http://schemas.microsoft.com/office/drawing/2016/ink" xmlns:am3d="http://schemas.microsoft.com/office/drawing/2017/model3d" xmlns:o="urn:schemas-microsoft-com:office:office" xmlns:oel="http://schemas.microsoft.com/office/2019/extlst" xmlns:r="http://schemas.openxmlformats.org/officeDocument/2006/relationships" xmlns:m="http://schemas.openxmlformats.org/officeDocument/2006/math" xmlns:v="urn:schemas-microsoft-com:vml" xmlns:wp14="http://schemas.microsoft.com/office/word/2010/wordprocessingDrawing" xmlns:wp="http://schemas.openxmlformats.org/drawingml/2006/wordprocessingDrawing" xmlns:w10="urn:schemas-microsoft-com:office:word" xmlns:w="http://schemas.openxmlformats.org/wordprocessingml/2006/main" xmlns:w14="http://schemas.microsoft.com/office/word/2010/wordml" xmlns:w15="http://schemas.microsoft.com/office/word/2012/wordml" xmlns:w16cei="http://schemas.microsoft.com/office/word/2026/wordml/cei" xmlns:w16cex="http://schemas.microsoft.com/office/word/2018/wordml/cex" xmlns:w16cid="http://schemas.microsoft.com/office/word/2016/wordml/cid" xmlns:w16="http://schemas.microsoft.com/office/word/2018/wordml" xmlns:w16du="http://schemas.microsoft.com/office/word/2023/wordml/word16du" xmlns:w16sdtdh="http://schemas.microsoft.com/office/word/2020/wordml/sdtdatahash" xmlns:w16sdtfl="http://schemas.microsoft.com/office/word/2024/wordml/sdtformatlock" xmlns:w16se="http://schemas.microsoft.com/office/word/2015/wordml/symex" xmlns:wpg="http://schemas.microsoft.com/office/word/2010/wordprocessingGroup" xmlns:wpi="http://schemas.microsoft.com/office/word/2010/wordprocessingInk" xmlns:wne="http://schemas.microsoft.com/office/word/2006/wordml" xmlns:wps="http://schemas.microsoft.com/office/word/2010/wordprocessingShape" mc:Ignorable="w14 w15 w16se w16cid w16 w16cex w16sdtdh w16sdtfl w16du wp14">
   <w:endnote w:type="separator" w:id="-1">
     <w:p>
       <w:pPr>
@@ -2655,7 +2581,7 @@
 </file>
 
 <file path=word/footer1.xml><?xml version="1.0" encoding="utf-8"?>
-<w:ftr xmlns:wpc="http://schemas.microsoft.com/office/word/2010/wordprocessingCanvas" xmlns:cx="http://schemas.microsoft.com/office/drawing/2014/chartex" xmlns:cx1="http://schemas.microsoft.com/office/drawing/2015/9/8/chartex" xmlns:cx2="http://schemas.microsoft.com/office/drawing/2015/10/21/chartex" xmlns:cx3="http://schemas.microsoft.com/office/drawing/2016/5/9/chartex" xmlns:cx4="http://schemas.microsoft.com/office/drawing/2016/5/10/chartex" xmlns:cx5="http://schemas.microsoft.com/office/drawing/2016/5/11/chartex" xmlns:cx6="http://schemas.microsoft.com/office/drawing/2016/5/12/chartex" xmlns:cx7="http://schemas.microsoft.com/office/drawing/2016/5/13/chartex" xmlns:cx8="http://schemas.microsoft.com/office/drawing/2016/5/14/chartex" xmlns:mc="http://schemas.openxmlformats.org/markup-compatibility/2006" xmlns:aink="http://schemas.microsoft.com/office/drawing/2016/ink" xmlns:am3d="http://schemas.microsoft.com/office/drawing/2017/model3d" xmlns:o="urn:schemas-microsoft-com:office:office" xmlns:oel="http://schemas.microsoft.com/office/2019/extlst" xmlns:r="http://schemas.openxmlformats.org/officeDocument/2006/relationships" xmlns:m="http://schemas.openxmlformats.org/officeDocument/2006/math" xmlns:v="urn:schemas-microsoft-com:vml" xmlns:wp14="http://schemas.microsoft.com/office/word/2010/wordprocessingDrawing" xmlns:wp="http://schemas.openxmlformats.org/drawingml/2006/wordprocessingDrawing" xmlns:w10="urn:schemas-microsoft-com:office:word" xmlns:w="http://schemas.openxmlformats.org/wordprocessingml/2006/main" xmlns:w14="http://schemas.microsoft.com/office/word/2010/wordml" xmlns:w15="http://schemas.microsoft.com/office/word/2012/wordml" xmlns:w16cex="http://schemas.microsoft.com/office/word/2018/wordml/cex" xmlns:w16cid="http://schemas.microsoft.com/office/word/2016/wordml/cid" xmlns:w16="http://schemas.microsoft.com/office/word/2018/wordml" xmlns:w16du="http://schemas.microsoft.com/office/word/2023/wordml/word16du" xmlns:w16sdtdh="http://schemas.microsoft.com/office/word/2020/wordml/sdtdatahash" xmlns:w16sdtfl="http://schemas.microsoft.com/office/word/2024/wordml/sdtformatlock" xmlns:w16se="http://schemas.microsoft.com/office/word/2015/wordml/symex" xmlns:wpg="http://schemas.microsoft.com/office/word/2010/wordprocessingGroup" xmlns:wpi="http://schemas.microsoft.com/office/word/2010/wordprocessingInk" xmlns:wne="http://schemas.microsoft.com/office/word/2006/wordml" xmlns:wps="http://schemas.microsoft.com/office/word/2010/wordprocessingShape" mc:Ignorable="w14 w15 w16se w16cid w16 w16cex w16sdtdh w16sdtfl w16du wp14">
+<w:ftr xmlns:wpc="http://schemas.microsoft.com/office/word/2010/wordprocessingCanvas" xmlns:cx="http://schemas.microsoft.com/office/drawing/2014/chartex" xmlns:cx1="http://schemas.microsoft.com/office/drawing/2015/9/8/chartex" xmlns:cx2="http://schemas.microsoft.com/office/drawing/2015/10/21/chartex" xmlns:cx3="http://schemas.microsoft.com/office/drawing/2016/5/9/chartex" xmlns:cx4="http://schemas.microsoft.com/office/drawing/2016/5/10/chartex" xmlns:cx5="http://schemas.microsoft.com/office/drawing/2016/5/11/chartex" xmlns:cx6="http://schemas.microsoft.com/office/drawing/2016/5/12/chartex" xmlns:cx7="http://schemas.microsoft.com/office/drawing/2016/5/13/chartex" xmlns:cx8="http://schemas.microsoft.com/office/drawing/2016/5/14/chartex" xmlns:mc="http://schemas.openxmlformats.org/markup-compatibility/2006" xmlns:aink="http://schemas.microsoft.com/office/drawing/2016/ink" xmlns:am3d="http://schemas.microsoft.com/office/drawing/2017/model3d" xmlns:o="urn:schemas-microsoft-com:office:office" xmlns:oel="http://schemas.microsoft.com/office/2019/extlst" xmlns:r="http://schemas.openxmlformats.org/officeDocument/2006/relationships" xmlns:m="http://schemas.openxmlformats.org/officeDocument/2006/math" xmlns:v="urn:schemas-microsoft-com:vml" xmlns:wp14="http://schemas.microsoft.com/office/word/2010/wordprocessingDrawing" xmlns:wp="http://schemas.openxmlformats.org/drawingml/2006/wordprocessingDrawing" xmlns:w10="urn:schemas-microsoft-com:office:word" xmlns:w="http://schemas.openxmlformats.org/wordprocessingml/2006/main" xmlns:w14="http://schemas.microsoft.com/office/word/2010/wordml" xmlns:w15="http://schemas.microsoft.com/office/word/2012/wordml" xmlns:w16cei="http://schemas.microsoft.com/office/word/2026/wordml/cei" xmlns:w16cex="http://schemas.microsoft.com/office/word/2018/wordml/cex" xmlns:w16cid="http://schemas.microsoft.com/office/word/2016/wordml/cid" xmlns:w16="http://schemas.microsoft.com/office/word/2018/wordml" xmlns:w16du="http://schemas.microsoft.com/office/word/2023/wordml/word16du" xmlns:w16sdtdh="http://schemas.microsoft.com/office/word/2020/wordml/sdtdatahash" xmlns:w16sdtfl="http://schemas.microsoft.com/office/word/2024/wordml/sdtformatlock" xmlns:w16se="http://schemas.microsoft.com/office/word/2015/wordml/symex" xmlns:wpg="http://schemas.microsoft.com/office/word/2010/wordprocessingGroup" xmlns:wpi="http://schemas.microsoft.com/office/word/2010/wordprocessingInk" xmlns:wne="http://schemas.microsoft.com/office/word/2006/wordml" xmlns:wps="http://schemas.microsoft.com/office/word/2010/wordprocessingShape" mc:Ignorable="w14 w15 w16se w16cid w16 w16cex w16sdtdh w16sdtfl w16du wp14">
   <w:p>
     <w:pPr>
       <w:pStyle w:val="Footer"/>
@@ -2788,6 +2714,8 @@
       <w:ind w:left="0"/>
       <w:rPr>
         <w:rFonts w:ascii="Times New Roman" w:hAnsi="Times New Roman" w:cs="Times New Roman"/>
+        <w:b/>
+        <w:bCs/>
         <w:sz w:val="22"/>
         <w:szCs w:val="22"/>
       </w:rPr>
@@ -2817,13 +2745,62 @@
         <w:szCs w:val="22"/>
       </w:rPr>
       <w:t>DEEP CITY BUILDING NO I CO-OP HOUSING SOCIETY</w:t>
+    </w:r>
+  </w:p>
+  <w:p>
+    <w:pPr>
+      <w:pStyle w:val="Footer"/>
+      <w:ind w:left="0"/>
+      <w:rPr>
+        <w:rFonts w:ascii="Times New Roman" w:hAnsi="Times New Roman" w:cs="Times New Roman"/>
+        <w:sz w:val="22"/>
+        <w:szCs w:val="22"/>
+      </w:rPr>
+    </w:pPr>
+    <w:r>
+      <w:rPr>
+        <w:rFonts w:ascii="Times New Roman" w:hAnsi="Times New Roman" w:cs="Times New Roman"/>
+        <w:b/>
+        <w:bCs/>
+        <w:sz w:val="22"/>
+        <w:szCs w:val="22"/>
+      </w:rPr>
+      <w:t xml:space="preserve">         </w:t>
+    </w:r>
+    <w:r>
+      <w:rPr>
+        <w:rFonts w:ascii="Times New Roman" w:hAnsi="Times New Roman" w:cs="Times New Roman"/>
+        <w:b/>
+        <w:bCs/>
+        <w:sz w:val="22"/>
+        <w:szCs w:val="22"/>
+      </w:rPr>
+      <w:t>Disclaimer:</w:t>
+    </w:r>
+    <w:r>
+      <w:rPr>
+        <w:rFonts w:ascii="Times New Roman" w:hAnsi="Times New Roman" w:cs="Times New Roman"/>
+        <w:sz w:val="22"/>
+        <w:szCs w:val="22"/>
+      </w:rPr>
+      <w:t xml:space="preserve"> </w:t>
+    </w:r>
+    <w:r>
+      <w:rPr>
+        <w:rFonts w:ascii="Times New Roman" w:hAnsi="Times New Roman" w:cs="Times New Roman"/>
+        <w:i/>
+        <w:iCs/>
+        <w:sz w:val="22"/>
+        <w:szCs w:val="22"/>
+      </w:rPr>
+      <w:t>This is a computer-generated invoice. No physical signature is required.</w:t>
     </w:r>
   </w:p>
 </w:ftr>
 </file>
 
 <file path=word/footnotes.xml><?xml version="1.0" encoding="utf-8"?>
-<w:footnotes xmlns:wpc="http://schemas.microsoft.com/office/word/2010/wordprocessingCanvas" xmlns:cx="http://schemas.microsoft.com/office/drawing/2014/chartex" xmlns:cx1="http://schemas.microsoft.com/office/drawing/2015/9/8/chartex" xmlns:cx2="http://schemas.microsoft.com/office/drawing/2015/10/21/chartex" xmlns:cx3="http://schemas.microsoft.com/office/drawing/2016/5/9/chartex" xmlns:cx4="http://schemas.microsoft.com/office/drawing/2016/5/10/chartex" xmlns:cx5="http://schemas.microsoft.com/office/drawing/2016/5/11/chartex" xmlns:cx6="http://schemas.microsoft.com/office/drawing/2016/5/12/chartex" xmlns:cx7="http://schemas.microsoft.com/office/drawing/2016/5/13/chartex" xmlns:cx8="http://schemas.microsoft.com/office/drawing/2016/5/14/chartex" xmlns:mc="http://schemas.openxmlformats.org/markup-compatibility/2006" xmlns:aink="http://schemas.microsoft.com/office/drawing/2016/ink" xmlns:am3d="http://schemas.microsoft.com/office/drawing/2017/model3d" xmlns:o="urn:schemas-microsoft-com:office:office" xmlns:oel="http://schemas.microsoft.com/office/2019/extlst" xmlns:r="http://schemas.openxmlformats.org/officeDocument/2006/relationships" xmlns:m="http://schemas.openxmlformats.org/officeDocument/2006/math" xmlns:v="urn:schemas-microsoft-com:vml" xmlns:wp14="http://schemas.microsoft.com/office/word/2010/wordprocessingDrawing" xmlns:wp="http://schemas.openxmlformats.org/drawingml/2006/wordprocessingDrawing" xmlns:w10="urn:schemas-microsoft-com:office:word" xmlns:w="http://schemas.openxmlformats.org/wordprocessingml/2006/main" xmlns:w14="http://schemas.microsoft.com/office/word/2010/wordml" xmlns:w15="http://schemas.microsoft.com/office/word/2012/wordml" xmlns:w16cex="http://schemas.microsoft.com/office/word/2018/wordml/cex" xmlns:w16cid="http://schemas.microsoft.com/office/word/2016/wordml/cid" xmlns:w16="http://schemas.microsoft.com/office/word/2018/wordml" xmlns:w16du="http://schemas.microsoft.com/office/word/2023/wordml/word16du" xmlns:w16sdtdh="http://schemas.microsoft.com/office/word/2020/wordml/sdtdatahash" xmlns:w16sdtfl="http://schemas.microsoft.com/office/word/2024/wordml/sdtformatlock" xmlns:w16se="http://schemas.microsoft.com/office/word/2015/wordml/symex" xmlns:wpg="http://schemas.microsoft.com/office/word/2010/wordprocessingGroup" xmlns:wpi="http://schemas.microsoft.com/office/word/2010/wordprocessingInk" xmlns:wne="http://schemas.microsoft.com/office/word/2006/wordml" xmlns:wps="http://schemas.microsoft.com/office/word/2010/wordprocessingShape" mc:Ignorable="w14 w15 w16se w16cid w16 w16cex w16sdtdh w16sdtfl w16du wp14">
+<w:footnotes xmlns:wpc="http://schemas.microsoft.com/office/word/2010/wordprocessingCanvas" xmlns:cx="http://schemas.microsoft.com/office/drawing/2014/chartex" xmlns:cx1="http://schemas.microsoft.com/office/drawing/2015/9/8/chartex" xmlns:cx2="http://schemas.microsoft.com/office/drawing/2015/10/21/chartex" xmlns:cx3="http://schemas.microsoft.com/office/drawing/2016/5/9/chartex" xmlns:cx4="http://schemas.microsoft.com/office/drawing/2016/5/10/chartex" xmlns:cx5="http://schemas.microsoft.com/office/drawing/2016/5/11/chartex" xmlns:cx6="http://schemas.microsoft.com/office/drawing/2016/5/12/chartex" xmlns:cx7="http://schemas.microsoft.com/office/drawing/2016/5/13/chartex" xmlns:cx8="http://schemas.microsoft.com/office/drawing/2016/5/14/chartex" xmlns:mc="http://schemas.openxmlformats.org/markup-compatibility/2006" xmlns:aink="http://schemas.microsoft.com/office/drawing/2016/ink" xmlns:am3d="http://schemas.microsoft.com/office/drawing/2017/model3d" xmlns:o="urn:schemas-microsoft-com:office:office" xmlns:oel="http://schemas.microsoft.com/office/2019/extlst" xmlns:r="http://schemas.openxmlformats.org/officeDocument/2006/relationships" xmlns:m="http://schemas.openxmlformats.org/officeDocument/2006/math" xmlns:v="urn:schemas-microsoft-com:vml" xmlns:wp14="http://schemas.microsoft.com/office/word/2010/wordprocessingDrawing" xmlns:wp="http://schemas.openxmlformats.org/drawingml/2006/wordprocessingDrawing" xmlns:w10="urn:schemas-microsoft-com:office:word" xmlns:w="http://schemas.openxmlformats.org/wordprocessingml/2006/main" xmlns:w14="http://schemas.microsoft.com/office/word/2010/wordml" xmlns:w15="http://schemas.microsoft.com/office/word/2012/wordml" xmlns:w16cei="http://schemas.microsoft.com/office/word/2026/wordml/cei" xmlns:w16cex="http://schemas.microsoft.com/office/word/2018/wordml/cex" xmlns:w16cid="http://schemas.microsoft.com/office/word/2016/wordml/cid" xmlns:w16="http://schemas.microsoft.com/office/word/2018/wordml" xmlns:w16du="http://schemas.microsoft.com/office/word/2023/wordml/word16du" xmlns:w16sdtdh="http://schemas.microsoft.com/office/word/2020/wordml/sdtdatahash" xmlns:w16sdtfl="http://schemas.microsoft.com/office/word/2024/wordml/sdtformatlock" xmlns:w16se="http://schemas.microsoft.com/office/word/2015/wordml/symex" xmlns:wpg="http://schemas.microsoft.com/office/word/2010/wordprocessingGroup" xmlns:wpi="http://schemas.microsoft.com/office/word/2010/wordprocessingInk" xmlns:wne="http://schemas.microsoft.com/office/word/2006/wordml" xmlns:wps="http://schemas.microsoft.com/office/word/2010/wordprocessingShape" mc:Ignorable="w14 w15 w16se w16cid w16 w16cex w16sdtdh w16sdtfl w16du wp14">
   <w:footnote w:type="separator" w:id="-1">
     <w:p>
       <w:pPr>
@@ -2848,7 +2825,7 @@
 </file>
 
 <file path=word/header1.xml><?xml version="1.0" encoding="utf-8"?>
-<w:hdr xmlns:wpc="http://schemas.microsoft.com/office/word/2010/wordprocessingCanvas" xmlns:cx="http://schemas.microsoft.com/office/drawing/2014/chartex" xmlns:cx1="http://schemas.microsoft.com/office/drawing/2015/9/8/chartex" xmlns:cx2="http://schemas.microsoft.com/office/drawing/2015/10/21/chartex" xmlns:cx3="http://schemas.microsoft.com/office/drawing/2016/5/9/chartex" xmlns:cx4="http://schemas.microsoft.com/office/drawing/2016/5/10/chartex" xmlns:cx5="http://schemas.microsoft.com/office/drawing/2016/5/11/chartex" xmlns:cx6="http://schemas.microsoft.com/office/drawing/2016/5/12/chartex" xmlns:cx7="http://schemas.microsoft.com/office/drawing/2016/5/13/chartex" xmlns:cx8="http://schemas.microsoft.com/office/drawing/2016/5/14/chartex" xmlns:mc="http://schemas.openxmlformats.org/markup-compatibility/2006" xmlns:aink="http://schemas.microsoft.com/office/drawing/2016/ink" xmlns:am3d="http://schemas.microsoft.com/office/drawing/2017/model3d" xmlns:o="urn:schemas-microsoft-com:office:office" xmlns:oel="http://schemas.microsoft.com/office/2019/extlst" xmlns:r="http://schemas.openxmlformats.org/officeDocument/2006/relationships" xmlns:m="http://schemas.openxmlformats.org/officeDocument/2006/math" xmlns:v="urn:schemas-microsoft-com:vml" xmlns:wp14="http://schemas.microsoft.com/office/word/2010/wordprocessingDrawing" xmlns:wp="http://schemas.openxmlformats.org/drawingml/2006/wordprocessingDrawing" xmlns:w10="urn:schemas-microsoft-com:office:word" xmlns:w="http://schemas.openxmlformats.org/wordprocessingml/2006/main" xmlns:w14="http://schemas.microsoft.com/office/word/2010/wordml" xmlns:w15="http://schemas.microsoft.com/office/word/2012/wordml" xmlns:w16cex="http://schemas.microsoft.com/office/word/2018/wordml/cex" xmlns:w16cid="http://schemas.microsoft.com/office/word/2016/wordml/cid" xmlns:w16="http://schemas.microsoft.com/office/word/2018/wordml" xmlns:w16du="http://schemas.microsoft.com/office/word/2023/wordml/word16du" xmlns:w16sdtdh="http://schemas.microsoft.com/office/word/2020/wordml/sdtdatahash" xmlns:w16sdtfl="http://schemas.microsoft.com/office/word/2024/wordml/sdtformatlock" xmlns:w16se="http://schemas.microsoft.com/office/word/2015/wordml/symex" xmlns:wpg="http://schemas.microsoft.com/office/word/2010/wordprocessingGroup" xmlns:wpi="http://schemas.microsoft.com/office/word/2010/wordprocessingInk" xmlns:wne="http://schemas.microsoft.com/office/word/2006/wordml" xmlns:wps="http://schemas.microsoft.com/office/word/2010/wordprocessingShape" mc:Ignorable="w14 w15 w16se w16cid w16 w16cex w16sdtdh w16sdtfl w16du wp14">
+<w:hdr xmlns:wpc="http://schemas.microsoft.com/office/word/2010/wordprocessingCanvas" xmlns:cx="http://schemas.microsoft.com/office/drawing/2014/chartex" xmlns:cx1="http://schemas.microsoft.com/office/drawing/2015/9/8/chartex" xmlns:cx2="http://schemas.microsoft.com/office/drawing/2015/10/21/chartex" xmlns:cx3="http://schemas.microsoft.com/office/drawing/2016/5/9/chartex" xmlns:cx4="http://schemas.microsoft.com/office/drawing/2016/5/10/chartex" xmlns:cx5="http://schemas.microsoft.com/office/drawing/2016/5/11/chartex" xmlns:cx6="http://schemas.microsoft.com/office/drawing/2016/5/12/chartex" xmlns:cx7="http://schemas.microsoft.com/office/drawing/2016/5/13/chartex" xmlns:cx8="http://schemas.microsoft.com/office/drawing/2016/5/14/chartex" xmlns:mc="http://schemas.openxmlformats.org/markup-compatibility/2006" xmlns:aink="http://schemas.microsoft.com/office/drawing/2016/ink" xmlns:am3d="http://schemas.microsoft.com/office/drawing/2017/model3d" xmlns:o="urn:schemas-microsoft-com:office:office" xmlns:oel="http://schemas.microsoft.com/office/2019/extlst" xmlns:r="http://schemas.openxmlformats.org/officeDocument/2006/relationships" xmlns:m="http://schemas.openxmlformats.org/officeDocument/2006/math" xmlns:v="urn:schemas-microsoft-com:vml" xmlns:wp14="http://schemas.microsoft.com/office/word/2010/wordprocessingDrawing" xmlns:wp="http://schemas.openxmlformats.org/drawingml/2006/wordprocessingDrawing" xmlns:w10="urn:schemas-microsoft-com:office:word" xmlns:w="http://schemas.openxmlformats.org/wordprocessingml/2006/main" xmlns:w14="http://schemas.microsoft.com/office/word/2010/wordml" xmlns:w15="http://schemas.microsoft.com/office/word/2012/wordml" xmlns:w16cei="http://schemas.microsoft.com/office/word/2026/wordml/cei" xmlns:w16cex="http://schemas.microsoft.com/office/word/2018/wordml/cex" xmlns:w16cid="http://schemas.microsoft.com/office/word/2016/wordml/cid" xmlns:w16="http://schemas.microsoft.com/office/word/2018/wordml" xmlns:w16du="http://schemas.microsoft.com/office/word/2023/wordml/word16du" xmlns:w16sdtdh="http://schemas.microsoft.com/office/word/2020/wordml/sdtdatahash" xmlns:w16sdtfl="http://schemas.microsoft.com/office/word/2024/wordml/sdtformatlock" xmlns:w16se="http://schemas.microsoft.com/office/word/2015/wordml/symex" xmlns:wpg="http://schemas.microsoft.com/office/word/2010/wordprocessingGroup" xmlns:wpi="http://schemas.microsoft.com/office/word/2010/wordprocessingInk" xmlns:wne="http://schemas.microsoft.com/office/word/2006/wordml" xmlns:wps="http://schemas.microsoft.com/office/word/2010/wordprocessingShape" mc:Ignorable="w14 w15 w16se w16cid w16 w16cex w16sdtdh w16sdtfl w16du wp14">
   <w:p>
     <w:pPr>
       <w:pStyle w:val="Header"/>
@@ -2859,28 +2836,6 @@
         <w:bCs/>
       </w:rPr>
     </w:pPr>
-    <w:r>
-      <w:rPr>
-        <w:rFonts w:ascii="Times New Roman" w:hAnsi="Times New Roman" w:cs="Times New Roman"/>
-        <w:b/>
-        <w:bCs/>
-        <w:color w:val="FF0000"/>
-        <w:sz w:val="32"/>
-        <w:szCs w:val="32"/>
-      </w:rPr>
-      <w:t>Receipt</w:t>
-    </w:r>
-    <w:r>
-      <w:rPr>
-        <w:rFonts w:ascii="Times New Roman" w:hAnsi="Times New Roman" w:cs="Times New Roman"/>
-        <w:b/>
-        <w:bCs/>
-        <w:color w:val="FF0000"/>
-        <w:sz w:val="60"/>
-        <w:szCs w:val="280"/>
-      </w:rPr>
-      <w:br/>
-    </w:r>
     <w:r>
       <w:rPr>
         <w:rFonts w:ascii="Times New Roman" w:hAnsi="Times New Roman" w:cs="Times New Roman"/>
@@ -3195,7 +3150,7 @@
 </file>
 
 <file path=word/numbering.xml><?xml version="1.0" encoding="utf-8"?>
-<w:numbering xmlns:wpc="http://schemas.microsoft.com/office/word/2010/wordprocessingCanvas" xmlns:cx="http://schemas.microsoft.com/office/drawing/2014/chartex" xmlns:cx1="http://schemas.microsoft.com/office/drawing/2015/9/8/chartex" xmlns:cx2="http://schemas.microsoft.com/office/drawing/2015/10/21/chartex" xmlns:cx3="http://schemas.microsoft.com/office/drawing/2016/5/9/chartex" xmlns:cx4="http://schemas.microsoft.com/office/drawing/2016/5/10/chartex" xmlns:cx5="http://schemas.microsoft.com/office/drawing/2016/5/11/chartex" xmlns:cx6="http://schemas.microsoft.com/office/drawing/2016/5/12/chartex" xmlns:cx7="http://schemas.microsoft.com/office/drawing/2016/5/13/chartex" xmlns:cx8="http://schemas.microsoft.com/office/drawing/2016/5/14/chartex" xmlns:mc="http://schemas.openxmlformats.org/markup-compatibility/2006" xmlns:aink="http://schemas.microsoft.com/office/drawing/2016/ink" xmlns:am3d="http://schemas.microsoft.com/office/drawing/2017/model3d" xmlns:o="urn:schemas-microsoft-com:office:office" xmlns:oel="http://schemas.microsoft.com/office/2019/extlst" xmlns:r="http://schemas.openxmlformats.org/officeDocument/2006/relationships" xmlns:m="http://schemas.openxmlformats.org/officeDocument/2006/math" xmlns:v="urn:schemas-microsoft-com:vml" xmlns:wp14="http://schemas.microsoft.com/office/word/2010/wordprocessingDrawing" xmlns:wp="http://schemas.openxmlformats.org/drawingml/2006/wordprocessingDrawing" xmlns:w10="urn:schemas-microsoft-com:office:word" xmlns:w="http://schemas.openxmlformats.org/wordprocessingml/2006/main" xmlns:w14="http://schemas.microsoft.com/office/word/2010/wordml" xmlns:w15="http://schemas.microsoft.com/office/word/2012/wordml" xmlns:w16cex="http://schemas.microsoft.com/office/word/2018/wordml/cex" xmlns:w16cid="http://schemas.microsoft.com/office/word/2016/wordml/cid" xmlns:w16="http://schemas.microsoft.com/office/word/2018/wordml" xmlns:w16du="http://schemas.microsoft.com/office/word/2023/wordml/word16du" xmlns:w16sdtdh="http://schemas.microsoft.com/office/word/2020/wordml/sdtdatahash" xmlns:w16sdtfl="http://schemas.microsoft.com/office/word/2024/wordml/sdtformatlock" xmlns:w16se="http://schemas.microsoft.com/office/word/2015/wordml/symex" xmlns:wpg="http://schemas.microsoft.com/office/word/2010/wordprocessingGroup" xmlns:wpi="http://schemas.microsoft.com/office/word/2010/wordprocessingInk" xmlns:wne="http://schemas.microsoft.com/office/word/2006/wordml" xmlns:wps="http://schemas.microsoft.com/office/word/2010/wordprocessingShape" mc:Ignorable="w14 w15 w16se w16cid w16 w16cex w16sdtdh w16sdtfl w16du wp14">
+<w:numbering xmlns:wpc="http://schemas.microsoft.com/office/word/2010/wordprocessingCanvas" xmlns:cx="http://schemas.microsoft.com/office/drawing/2014/chartex" xmlns:cx1="http://schemas.microsoft.com/office/drawing/2015/9/8/chartex" xmlns:cx2="http://schemas.microsoft.com/office/drawing/2015/10/21/chartex" xmlns:cx3="http://schemas.microsoft.com/office/drawing/2016/5/9/chartex" xmlns:cx4="http://schemas.microsoft.com/office/drawing/2016/5/10/chartex" xmlns:cx5="http://schemas.microsoft.com/office/drawing/2016/5/11/chartex" xmlns:cx6="http://schemas.microsoft.com/office/drawing/2016/5/12/chartex" xmlns:cx7="http://schemas.microsoft.com/office/drawing/2016/5/13/chartex" xmlns:cx8="http://schemas.microsoft.com/office/drawing/2016/5/14/chartex" xmlns:mc="http://schemas.openxmlformats.org/markup-compatibility/2006" xmlns:aink="http://schemas.microsoft.com/office/drawing/2016/ink" xmlns:am3d="http://schemas.microsoft.com/office/drawing/2017/model3d" xmlns:o="urn:schemas-microsoft-com:office:office" xmlns:oel="http://schemas.microsoft.com/office/2019/extlst" xmlns:r="http://schemas.openxmlformats.org/officeDocument/2006/relationships" xmlns:m="http://schemas.openxmlformats.org/officeDocument/2006/math" xmlns:v="urn:schemas-microsoft-com:vml" xmlns:wp14="http://schemas.microsoft.com/office/word/2010/wordprocessingDrawing" xmlns:wp="http://schemas.openxmlformats.org/drawingml/2006/wordprocessingDrawing" xmlns:w10="urn:schemas-microsoft-com:office:word" xmlns:w="http://schemas.openxmlformats.org/wordprocessingml/2006/main" xmlns:w14="http://schemas.microsoft.com/office/word/2010/wordml" xmlns:w15="http://schemas.microsoft.com/office/word/2012/wordml" xmlns:w16cei="http://schemas.microsoft.com/office/word/2026/wordml/cei" xmlns:w16cex="http://schemas.microsoft.com/office/word/2018/wordml/cex" xmlns:w16cid="http://schemas.microsoft.com/office/word/2016/wordml/cid" xmlns:w16="http://schemas.microsoft.com/office/word/2018/wordml" xmlns:w16du="http://schemas.microsoft.com/office/word/2023/wordml/word16du" xmlns:w16sdtdh="http://schemas.microsoft.com/office/word/2020/wordml/sdtdatahash" xmlns:w16sdtfl="http://schemas.microsoft.com/office/word/2024/wordml/sdtformatlock" xmlns:w16se="http://schemas.microsoft.com/office/word/2015/wordml/symex" xmlns:wpg="http://schemas.microsoft.com/office/word/2010/wordprocessingGroup" xmlns:wpi="http://schemas.microsoft.com/office/word/2010/wordprocessingInk" xmlns:wne="http://schemas.microsoft.com/office/word/2006/wordml" xmlns:wps="http://schemas.microsoft.com/office/word/2010/wordprocessingShape" mc:Ignorable="w14 w15 w16se w16cid w16 w16cex w16sdtdh w16sdtfl w16du wp14">
   <w:abstractNum w:abstractNumId="0" w15:restartNumberingAfterBreak="0">
     <w:nsid w:val="FFFFFF7C"/>
     <w:multiLevelType w:val="singleLevel"/>

</xml_diff>